<commit_message>
docs(outputs): regenerate the test record on clean commit a489cbf
12/12 tests passed; the record no longer notes uncommitted changes.

Co-Authored-By: Claude Opus 5.5 <noreply@anthropic.com>
</commit_message>
<xml_diff>
--- a/outputs/Bien_ban_test_Nhom13.docx
+++ b/outputs/Bien_ban_test_Nhom13.docx
@@ -262,7 +262,7 @@
             </w:pPr>
             <w:r>
               <w:rPr/>
-              <w:t xml:space="preserve">https://github.com/ndviet0303/atpm, commit 3e97573 (có sửa đổi chưa commit)</w:t>
+              <w:t xml:space="preserve">https://github.com/ndviet0303/atpm, commit a489cbf</w:t>
             </w:r>
           </w:p>
         </w:tc>
@@ -332,7 +332,7 @@
             </w:pPr>
             <w:r>
               <w:rPr/>
-              <w:t xml:space="preserve">23/10/2026 08:20:48 – 08:22:15 (87 giây)</w:t>
+              <w:t xml:space="preserve">23/10/2026 08:24:44 – 08:26:13 (89 giây)</w:t>
             </w:r>
           </w:p>
         </w:tc>
@@ -1097,7 +1097,7 @@
             </w:pPr>
             <w:r>
               <w:rPr/>
-              <w:t xml:space="preserve">0 / 28.0</w:t>
+              <w:t xml:space="preserve">0 / 30.1</w:t>
             </w:r>
           </w:p>
         </w:tc>
@@ -1207,7 +1207,7 @@
             </w:pPr>
             <w:r>
               <w:rPr/>
-              <w:t xml:space="preserve">0 / 2.5</w:t>
+              <w:t xml:space="preserve">0 / 3.2</w:t>
             </w:r>
           </w:p>
         </w:tc>
@@ -1427,7 +1427,7 @@
             </w:pPr>
             <w:r>
               <w:rPr/>
-              <w:t xml:space="preserve">0 / 3.2</w:t>
+              <w:t xml:space="preserve">0 / 3.1</w:t>
             </w:r>
           </w:p>
         </w:tc>
@@ -1647,7 +1647,7 @@
             </w:pPr>
             <w:r>
               <w:rPr/>
-              <w:t xml:space="preserve">0 / 10.9</w:t>
+              <w:t xml:space="preserve">0 / 10.8</w:t>
             </w:r>
           </w:p>
         </w:tc>
@@ -2087,7 +2087,7 @@
             </w:pPr>
             <w:r>
               <w:rPr/>
-              <w:t xml:space="preserve">0 / 22.1</w:t>
+              <w:t xml:space="preserve">0 / 21.6</w:t>
             </w:r>
           </w:p>
         </w:tc>

</xml_diff>